<commit_message>
looked a phase 1 doc
</commit_message>
<xml_diff>
--- a/deliverables/phase-1/CS-312-Project Phase - 1 Report Template.docx
+++ b/deliverables/phase-1/CS-312-Project Phase - 1 Report Template.docx
@@ -645,6 +645,7 @@
               </w:numPr>
             </w:pPr>
             <w:r>
+              <w:lastRenderedPageBreak/>
               <w:t>Allow users to rate recipes from 1 to 5 stars and leave comments to provide feedback or ask questions. </w:t>
             </w:r>
           </w:p>
@@ -1372,6 +1373,7 @@
               <w:jc w:val="center"/>
             </w:pPr>
             <w:r>
+              <w:lastRenderedPageBreak/>
               <w:t>5</w:t>
             </w:r>
           </w:p>
@@ -2438,6 +2440,7 @@
               <w:jc w:val="center"/>
             </w:pPr>
             <w:r>
+              <w:lastRenderedPageBreak/>
               <w:t>Task Type</w:t>
             </w:r>
           </w:p>
@@ -3063,6 +3066,7 @@
         <w:jc w:val="both"/>
       </w:pPr>
       <w:r>
+        <w:lastRenderedPageBreak/>
         <w:t>Incorporate</w:t>
       </w:r>
       <w:r>
@@ -3241,6 +3245,7 @@
         <w:rPr>
           <w:noProof/>
         </w:rPr>
+        <w:lastRenderedPageBreak/>
         <w:drawing>
           <wp:inline distT="0" distB="0" distL="0" distR="0" wp14:anchorId="20356678" wp14:editId="221B6289">
             <wp:extent cx="5943600" cy="3231515"/>
@@ -3333,6 +3338,7 @@
         <w:rPr>
           <w:noProof/>
         </w:rPr>
+        <w:lastRenderedPageBreak/>
         <w:drawing>
           <wp:inline distT="0" distB="0" distL="0" distR="0" wp14:anchorId="275136E2" wp14:editId="7B481D27">
             <wp:extent cx="5943600" cy="3231515"/>
@@ -3425,6 +3431,7 @@
         <w:rPr>
           <w:noProof/>
         </w:rPr>
+        <w:lastRenderedPageBreak/>
         <w:drawing>
           <wp:inline distT="0" distB="0" distL="0" distR="0" wp14:anchorId="3C55A661" wp14:editId="4D8428D9">
             <wp:extent cx="5943600" cy="3231515"/>

</xml_diff>